<commit_message>
This represents Discovery and Extract stages completed. The scripts and testing were completed for both Discovery and Extraction.
</commit_message>
<xml_diff>
--- a/docs/ChatGPT Upload Docs/AlphaOmega Directory Map.docx
+++ b/docs/ChatGPT Upload Docs/AlphaOmega Directory Map.docx
@@ -519,6 +519,28 @@
     <w:p>
       <w:pPr>
         <w:numPr>
+          <w:ilvl w:val="1"/>
+          <w:numId w:val="8"/>
+        </w:numPr>
+        <w:textAlignment w:val="center"/>
+        <w:rPr>
+          <w:rFonts w:ascii="Calibri" w:eastAsia="Times New Roman" w:hAnsi="Calibri" w:cs="Calibri"/>
+          <w:sz w:val="22"/>
+          <w:szCs w:val="22"/>
+        </w:rPr>
+      </w:pPr>
+      <w:r>
+        <w:rPr>
+          <w:rFonts w:ascii="Calibri" w:eastAsia="Times New Roman" w:hAnsi="Calibri" w:cs="Calibri"/>
+          <w:sz w:val="22"/>
+          <w:szCs w:val="22"/>
+        </w:rPr>
+        <w:t>security</w:t>
+      </w:r>
+    </w:p>
+    <w:p>
+      <w:pPr>
+        <w:numPr>
           <w:ilvl w:val="0"/>
           <w:numId w:val="1"/>
         </w:numPr>
@@ -998,6 +1020,7 @@
           <w:sz w:val="22"/>
           <w:szCs w:val="22"/>
         </w:rPr>
+        <w:lastRenderedPageBreak/>
         <w:t>translator</w:t>
       </w:r>
     </w:p>
@@ -1021,7 +1044,6 @@
           <w:sz w:val="22"/>
           <w:szCs w:val="22"/>
         </w:rPr>
-        <w:lastRenderedPageBreak/>
         <w:t>_pycache_</w:t>
       </w:r>
     </w:p>
@@ -1038,9 +1060,9 @@
 <file path=word/numbering.xml><?xml version="1.0" encoding="utf-8"?>
 <w:numbering xmlns:wpc="http://schemas.microsoft.com/office/word/2010/wordprocessingCanvas" xmlns:cx="http://schemas.microsoft.com/office/drawing/2014/chartex" xmlns:cx1="http://schemas.microsoft.com/office/drawing/2015/9/8/chartex" xmlns:cx2="http://schemas.microsoft.com/office/drawing/2015/10/21/chartex" xmlns:cx3="http://schemas.microsoft.com/office/drawing/2016/5/9/chartex" xmlns:cx4="http://schemas.microsoft.com/office/drawing/2016/5/10/chartex" xmlns:cx5="http://schemas.microsoft.com/office/drawing/2016/5/11/chartex" xmlns:cx6="http://schemas.microsoft.com/office/drawing/2016/5/12/chartex" xmlns:cx7="http://schemas.microsoft.com/office/drawing/2016/5/13/chartex" xmlns:cx8="http://schemas.microsoft.com/office/drawing/2016/5/14/chartex" xmlns:mc="http://schemas.openxmlformats.org/markup-compatibility/2006" xmlns:aink="http://schemas.microsoft.com/office/drawing/2016/ink" xmlns:am3d="http://schemas.microsoft.com/office/drawing/2017/model3d" xmlns:o="urn:schemas-microsoft-com:office:office" xmlns:oel="http://schemas.microsoft.com/office/2019/extlst" xmlns:r="http://schemas.openxmlformats.org/officeDocument/2006/relationships" xmlns:m="http://schemas.openxmlformats.org/officeDocument/2006/math" xmlns:v="urn:schemas-microsoft-com:vml" xmlns:wp14="http://schemas.microsoft.com/office/word/2010/wordprocessingDrawing" xmlns:wp="http://schemas.openxmlformats.org/drawingml/2006/wordprocessingDrawing" xmlns:w10="urn:schemas-microsoft-com:office:word" xmlns:w="http://schemas.openxmlformats.org/wordprocessingml/2006/main" xmlns:w14="http://schemas.microsoft.com/office/word/2010/wordml" xmlns:w15="http://schemas.microsoft.com/office/word/2012/wordml" xmlns:w16cei="http://schemas.microsoft.com/office/word/2026/wordml/cei" xmlns:w16cex="http://schemas.microsoft.com/office/word/2018/wordml/cex" xmlns:w16cid="http://schemas.microsoft.com/office/word/2016/wordml/cid" xmlns:w16="http://schemas.microsoft.com/office/word/2018/wordml" xmlns:w16du="http://schemas.microsoft.com/office/word/2023/wordml/word16du" xmlns:w16sdtdh="http://schemas.microsoft.com/office/word/2020/wordml/sdtdatahash" xmlns:w16sdtfl="http://schemas.microsoft.com/office/word/2024/wordml/sdtformatlock" xmlns:w16se="http://schemas.microsoft.com/office/word/2015/wordml/symex" xmlns:wpg="http://schemas.microsoft.com/office/word/2010/wordprocessingGroup" xmlns:wpi="http://schemas.microsoft.com/office/word/2010/wordprocessingInk" xmlns:wne="http://schemas.microsoft.com/office/word/2006/wordml" xmlns:wps="http://schemas.microsoft.com/office/word/2010/wordprocessingShape" mc:Ignorable="w14 w15 w16se w16cid w16 w16cex w16sdtdh w16sdtfl w16du wp14">
   <w:abstractNum w:abstractNumId="0" w15:restartNumberingAfterBreak="0">
-    <w:nsid w:val="5B662375"/>
+    <w:nsid w:val="1AB37AB8"/>
     <w:multiLevelType w:val="multilevel"/>
-    <w:tmpl w:val="6ABE7112"/>
+    <w:tmpl w:val="462C6A4E"/>
     <w:lvl w:ilvl="0">
       <w:start w:val="1"/>
       <w:numFmt w:val="decimal"/>
@@ -1150,20 +1172,20 @@
       </w:pPr>
     </w:lvl>
   </w:abstractNum>
-  <w:num w:numId="1" w16cid:durableId="611011372">
+  <w:num w:numId="1" w16cid:durableId="5443614">
     <w:abstractNumId w:val="0"/>
     <w:lvlOverride w:ilvl="0">
       <w:startOverride w:val="1"/>
     </w:lvlOverride>
   </w:num>
-  <w:num w:numId="2" w16cid:durableId="1008559410">
+  <w:num w:numId="2" w16cid:durableId="352222309">
     <w:abstractNumId w:val="0"/>
     <w:lvlOverride w:ilvl="0"/>
     <w:lvlOverride w:ilvl="1">
       <w:startOverride w:val="1"/>
     </w:lvlOverride>
   </w:num>
-  <w:num w:numId="3" w16cid:durableId="520241262">
+  <w:num w:numId="3" w16cid:durableId="1785494999">
     <w:abstractNumId w:val="0"/>
     <w:lvlOverride w:ilvl="0"/>
     <w:lvlOverride w:ilvl="1"/>
@@ -1171,7 +1193,7 @@
       <w:startOverride w:val="1"/>
     </w:lvlOverride>
   </w:num>
-  <w:num w:numId="4" w16cid:durableId="519315041">
+  <w:num w:numId="4" w16cid:durableId="929970124">
     <w:abstractNumId w:val="0"/>
     <w:lvlOverride w:ilvl="0"/>
     <w:lvlOverride w:ilvl="1"/>
@@ -1179,7 +1201,7 @@
       <w:startOverride w:val="1"/>
     </w:lvlOverride>
   </w:num>
-  <w:num w:numId="5" w16cid:durableId="1071000733">
+  <w:num w:numId="5" w16cid:durableId="1904562390">
     <w:abstractNumId w:val="0"/>
     <w:lvlOverride w:ilvl="0"/>
     <w:lvlOverride w:ilvl="1"/>
@@ -1187,7 +1209,7 @@
       <w:startOverride w:val="1"/>
     </w:lvlOverride>
   </w:num>
-  <w:num w:numId="6" w16cid:durableId="844437994">
+  <w:num w:numId="6" w16cid:durableId="1526096511">
     <w:abstractNumId w:val="0"/>
     <w:lvlOverride w:ilvl="0"/>
     <w:lvlOverride w:ilvl="1"/>
@@ -1196,49 +1218,49 @@
       <w:startOverride w:val="1"/>
     </w:lvlOverride>
   </w:num>
-  <w:num w:numId="7" w16cid:durableId="420683036">
+  <w:num w:numId="7" w16cid:durableId="984511447">
     <w:abstractNumId w:val="0"/>
     <w:lvlOverride w:ilvl="0"/>
     <w:lvlOverride w:ilvl="1">
       <w:startOverride w:val="1"/>
     </w:lvlOverride>
   </w:num>
-  <w:num w:numId="8" w16cid:durableId="1729109607">
+  <w:num w:numId="8" w16cid:durableId="340396659">
     <w:abstractNumId w:val="0"/>
     <w:lvlOverride w:ilvl="0"/>
     <w:lvlOverride w:ilvl="1">
       <w:startOverride w:val="1"/>
     </w:lvlOverride>
   </w:num>
-  <w:num w:numId="9" w16cid:durableId="827407840">
+  <w:num w:numId="9" w16cid:durableId="732196798">
     <w:abstractNumId w:val="0"/>
     <w:lvlOverride w:ilvl="0"/>
     <w:lvlOverride w:ilvl="1">
       <w:startOverride w:val="1"/>
     </w:lvlOverride>
   </w:num>
-  <w:num w:numId="10" w16cid:durableId="1159616031">
+  <w:num w:numId="10" w16cid:durableId="371345413">
     <w:abstractNumId w:val="0"/>
     <w:lvlOverride w:ilvl="0"/>
     <w:lvlOverride w:ilvl="1">
       <w:startOverride w:val="1"/>
     </w:lvlOverride>
   </w:num>
-  <w:num w:numId="11" w16cid:durableId="525293817">
+  <w:num w:numId="11" w16cid:durableId="172842775">
     <w:abstractNumId w:val="0"/>
     <w:lvlOverride w:ilvl="0"/>
     <w:lvlOverride w:ilvl="1">
       <w:startOverride w:val="1"/>
     </w:lvlOverride>
   </w:num>
-  <w:num w:numId="12" w16cid:durableId="1335307510">
+  <w:num w:numId="12" w16cid:durableId="1200775090">
     <w:abstractNumId w:val="0"/>
     <w:lvlOverride w:ilvl="0"/>
     <w:lvlOverride w:ilvl="1">
       <w:startOverride w:val="1"/>
     </w:lvlOverride>
   </w:num>
-  <w:num w:numId="13" w16cid:durableId="285815907">
+  <w:num w:numId="13" w16cid:durableId="784732340">
     <w:abstractNumId w:val="0"/>
     <w:lvlOverride w:ilvl="0"/>
     <w:lvlOverride w:ilvl="1"/>
@@ -1246,7 +1268,7 @@
       <w:startOverride w:val="1"/>
     </w:lvlOverride>
   </w:num>
-  <w:num w:numId="14" w16cid:durableId="80227476">
+  <w:num w:numId="14" w16cid:durableId="2112164708">
     <w:abstractNumId w:val="0"/>
     <w:lvlOverride w:ilvl="0"/>
     <w:lvlOverride w:ilvl="1"/>
@@ -1254,7 +1276,7 @@
       <w:startOverride w:val="1"/>
     </w:lvlOverride>
   </w:num>
-  <w:num w:numId="15" w16cid:durableId="2036924914">
+  <w:num w:numId="15" w16cid:durableId="377242049">
     <w:abstractNumId w:val="0"/>
     <w:lvlOverride w:ilvl="0"/>
     <w:lvlOverride w:ilvl="1"/>
@@ -1263,7 +1285,7 @@
       <w:startOverride w:val="1"/>
     </w:lvlOverride>
   </w:num>
-  <w:num w:numId="16" w16cid:durableId="1069305747">
+  <w:num w:numId="16" w16cid:durableId="377827473">
     <w:abstractNumId w:val="0"/>
     <w:lvlOverride w:ilvl="0"/>
     <w:lvlOverride w:ilvl="1"/>
@@ -1271,7 +1293,7 @@
       <w:startOverride w:val="1"/>
     </w:lvlOverride>
   </w:num>
-  <w:num w:numId="17" w16cid:durableId="830752551">
+  <w:num w:numId="17" w16cid:durableId="578174671">
     <w:abstractNumId w:val="0"/>
     <w:lvlOverride w:ilvl="0"/>
     <w:lvlOverride w:ilvl="1"/>

</xml_diff>

<commit_message>
This update respresents the end of the creation of Load stage. All testing has been successful.
</commit_message>
<xml_diff>
--- a/docs/ChatGPT Upload Docs/AlphaOmega Directory Map.docx
+++ b/docs/ChatGPT Upload Docs/AlphaOmega Directory Map.docx
@@ -975,7 +975,29 @@
           <w:sz w:val="22"/>
           <w:szCs w:val="22"/>
         </w:rPr>
-        <w:t>sync</w:t>
+        <w:t>extraction</w:t>
+      </w:r>
+    </w:p>
+    <w:p>
+      <w:pPr>
+        <w:numPr>
+          <w:ilvl w:val="1"/>
+          <w:numId w:val="12"/>
+        </w:numPr>
+        <w:textAlignment w:val="center"/>
+        <w:rPr>
+          <w:rFonts w:ascii="Calibri" w:eastAsia="Times New Roman" w:hAnsi="Calibri" w:cs="Calibri"/>
+          <w:sz w:val="22"/>
+          <w:szCs w:val="22"/>
+        </w:rPr>
+      </w:pPr>
+      <w:r>
+        <w:rPr>
+          <w:rFonts w:ascii="Calibri" w:eastAsia="Times New Roman" w:hAnsi="Calibri" w:cs="Calibri"/>
+          <w:sz w:val="22"/>
+          <w:szCs w:val="22"/>
+        </w:rPr>
+        <w:t>load</w:t>
       </w:r>
     </w:p>
     <w:p>
@@ -997,7 +1019,8 @@
           <w:sz w:val="22"/>
           <w:szCs w:val="22"/>
         </w:rPr>
-        <w:t>_pycache_</w:t>
+        <w:lastRenderedPageBreak/>
+        <w:t>sql</w:t>
       </w:r>
     </w:p>
     <w:p>
@@ -1006,22 +1029,20 @@
           <w:ilvl w:val="1"/>
           <w:numId w:val="12"/>
         </w:numPr>
-        <w:spacing w:after="160"/>
-        <w:textAlignment w:val="center"/>
-        <w:rPr>
-          <w:rFonts w:ascii="Calibri" w:eastAsia="Times New Roman" w:hAnsi="Calibri" w:cs="Calibri"/>
-          <w:sz w:val="22"/>
-          <w:szCs w:val="22"/>
-        </w:rPr>
-      </w:pPr>
-      <w:r>
-        <w:rPr>
-          <w:rFonts w:ascii="Calibri" w:eastAsia="Times New Roman" w:hAnsi="Calibri" w:cs="Calibri"/>
-          <w:sz w:val="22"/>
-          <w:szCs w:val="22"/>
-        </w:rPr>
-        <w:lastRenderedPageBreak/>
-        <w:t>translator</w:t>
+        <w:textAlignment w:val="center"/>
+        <w:rPr>
+          <w:rFonts w:ascii="Calibri" w:eastAsia="Times New Roman" w:hAnsi="Calibri" w:cs="Calibri"/>
+          <w:sz w:val="22"/>
+          <w:szCs w:val="22"/>
+        </w:rPr>
+      </w:pPr>
+      <w:r>
+        <w:rPr>
+          <w:rFonts w:ascii="Calibri" w:eastAsia="Times New Roman" w:hAnsi="Calibri" w:cs="Calibri"/>
+          <w:sz w:val="22"/>
+          <w:szCs w:val="22"/>
+        </w:rPr>
+        <w:t>sync</w:t>
       </w:r>
     </w:p>
     <w:p>
@@ -1029,6 +1050,51 @@
         <w:numPr>
           <w:ilvl w:val="2"/>
           <w:numId w:val="17"/>
+        </w:numPr>
+        <w:textAlignment w:val="center"/>
+        <w:rPr>
+          <w:rFonts w:ascii="Calibri" w:eastAsia="Times New Roman" w:hAnsi="Calibri" w:cs="Calibri"/>
+          <w:sz w:val="22"/>
+          <w:szCs w:val="22"/>
+        </w:rPr>
+      </w:pPr>
+      <w:r>
+        <w:rPr>
+          <w:rFonts w:ascii="Calibri" w:eastAsia="Times New Roman" w:hAnsi="Calibri" w:cs="Calibri"/>
+          <w:sz w:val="22"/>
+          <w:szCs w:val="22"/>
+        </w:rPr>
+        <w:t>_pycache_</w:t>
+      </w:r>
+    </w:p>
+    <w:p>
+      <w:pPr>
+        <w:numPr>
+          <w:ilvl w:val="1"/>
+          <w:numId w:val="12"/>
+        </w:numPr>
+        <w:spacing w:after="160"/>
+        <w:textAlignment w:val="center"/>
+        <w:rPr>
+          <w:rFonts w:ascii="Calibri" w:eastAsia="Times New Roman" w:hAnsi="Calibri" w:cs="Calibri"/>
+          <w:sz w:val="22"/>
+          <w:szCs w:val="22"/>
+        </w:rPr>
+      </w:pPr>
+      <w:r>
+        <w:rPr>
+          <w:rFonts w:ascii="Calibri" w:eastAsia="Times New Roman" w:hAnsi="Calibri" w:cs="Calibri"/>
+          <w:sz w:val="22"/>
+          <w:szCs w:val="22"/>
+        </w:rPr>
+        <w:t>translator</w:t>
+      </w:r>
+    </w:p>
+    <w:p>
+      <w:pPr>
+        <w:numPr>
+          <w:ilvl w:val="2"/>
+          <w:numId w:val="18"/>
         </w:numPr>
         <w:spacing w:after="160"/>
         <w:textAlignment w:val="center"/>
@@ -1060,9 +1126,9 @@
 <file path=word/numbering.xml><?xml version="1.0" encoding="utf-8"?>
 <w:numbering xmlns:wpc="http://schemas.microsoft.com/office/word/2010/wordprocessingCanvas" xmlns:cx="http://schemas.microsoft.com/office/drawing/2014/chartex" xmlns:cx1="http://schemas.microsoft.com/office/drawing/2015/9/8/chartex" xmlns:cx2="http://schemas.microsoft.com/office/drawing/2015/10/21/chartex" xmlns:cx3="http://schemas.microsoft.com/office/drawing/2016/5/9/chartex" xmlns:cx4="http://schemas.microsoft.com/office/drawing/2016/5/10/chartex" xmlns:cx5="http://schemas.microsoft.com/office/drawing/2016/5/11/chartex" xmlns:cx6="http://schemas.microsoft.com/office/drawing/2016/5/12/chartex" xmlns:cx7="http://schemas.microsoft.com/office/drawing/2016/5/13/chartex" xmlns:cx8="http://schemas.microsoft.com/office/drawing/2016/5/14/chartex" xmlns:mc="http://schemas.openxmlformats.org/markup-compatibility/2006" xmlns:aink="http://schemas.microsoft.com/office/drawing/2016/ink" xmlns:am3d="http://schemas.microsoft.com/office/drawing/2017/model3d" xmlns:o="urn:schemas-microsoft-com:office:office" xmlns:oel="http://schemas.microsoft.com/office/2019/extlst" xmlns:r="http://schemas.openxmlformats.org/officeDocument/2006/relationships" xmlns:m="http://schemas.openxmlformats.org/officeDocument/2006/math" xmlns:v="urn:schemas-microsoft-com:vml" xmlns:wp14="http://schemas.microsoft.com/office/word/2010/wordprocessingDrawing" xmlns:wp="http://schemas.openxmlformats.org/drawingml/2006/wordprocessingDrawing" xmlns:w10="urn:schemas-microsoft-com:office:word" xmlns:w="http://schemas.openxmlformats.org/wordprocessingml/2006/main" xmlns:w14="http://schemas.microsoft.com/office/word/2010/wordml" xmlns:w15="http://schemas.microsoft.com/office/word/2012/wordml" xmlns:w16cei="http://schemas.microsoft.com/office/word/2026/wordml/cei" xmlns:w16cex="http://schemas.microsoft.com/office/word/2018/wordml/cex" xmlns:w16cid="http://schemas.microsoft.com/office/word/2016/wordml/cid" xmlns:w16="http://schemas.microsoft.com/office/word/2018/wordml" xmlns:w16du="http://schemas.microsoft.com/office/word/2023/wordml/word16du" xmlns:w16sdtdh="http://schemas.microsoft.com/office/word/2020/wordml/sdtdatahash" xmlns:w16sdtfl="http://schemas.microsoft.com/office/word/2024/wordml/sdtformatlock" xmlns:w16se="http://schemas.microsoft.com/office/word/2015/wordml/symex" xmlns:wpg="http://schemas.microsoft.com/office/word/2010/wordprocessingGroup" xmlns:wpi="http://schemas.microsoft.com/office/word/2010/wordprocessingInk" xmlns:wne="http://schemas.microsoft.com/office/word/2006/wordml" xmlns:wps="http://schemas.microsoft.com/office/word/2010/wordprocessingShape" mc:Ignorable="w14 w15 w16se w16cid w16 w16cex w16sdtdh w16sdtfl w16du wp14">
   <w:abstractNum w:abstractNumId="0" w15:restartNumberingAfterBreak="0">
-    <w:nsid w:val="1AB37AB8"/>
+    <w:nsid w:val="2D9F5C20"/>
     <w:multiLevelType w:val="multilevel"/>
-    <w:tmpl w:val="462C6A4E"/>
+    <w:tmpl w:val="ECB09C2A"/>
     <w:lvl w:ilvl="0">
       <w:start w:val="1"/>
       <w:numFmt w:val="decimal"/>
@@ -1172,20 +1238,20 @@
       </w:pPr>
     </w:lvl>
   </w:abstractNum>
-  <w:num w:numId="1" w16cid:durableId="5443614">
+  <w:num w:numId="1" w16cid:durableId="729809087">
     <w:abstractNumId w:val="0"/>
     <w:lvlOverride w:ilvl="0">
       <w:startOverride w:val="1"/>
     </w:lvlOverride>
   </w:num>
-  <w:num w:numId="2" w16cid:durableId="352222309">
+  <w:num w:numId="2" w16cid:durableId="103310747">
     <w:abstractNumId w:val="0"/>
     <w:lvlOverride w:ilvl="0"/>
     <w:lvlOverride w:ilvl="1">
       <w:startOverride w:val="1"/>
     </w:lvlOverride>
   </w:num>
-  <w:num w:numId="3" w16cid:durableId="1785494999">
+  <w:num w:numId="3" w16cid:durableId="511144876">
     <w:abstractNumId w:val="0"/>
     <w:lvlOverride w:ilvl="0"/>
     <w:lvlOverride w:ilvl="1"/>
@@ -1193,7 +1259,7 @@
       <w:startOverride w:val="1"/>
     </w:lvlOverride>
   </w:num>
-  <w:num w:numId="4" w16cid:durableId="929970124">
+  <w:num w:numId="4" w16cid:durableId="1770352993">
     <w:abstractNumId w:val="0"/>
     <w:lvlOverride w:ilvl="0"/>
     <w:lvlOverride w:ilvl="1"/>
@@ -1201,7 +1267,7 @@
       <w:startOverride w:val="1"/>
     </w:lvlOverride>
   </w:num>
-  <w:num w:numId="5" w16cid:durableId="1904562390">
+  <w:num w:numId="5" w16cid:durableId="1651666844">
     <w:abstractNumId w:val="0"/>
     <w:lvlOverride w:ilvl="0"/>
     <w:lvlOverride w:ilvl="1"/>
@@ -1209,7 +1275,7 @@
       <w:startOverride w:val="1"/>
     </w:lvlOverride>
   </w:num>
-  <w:num w:numId="6" w16cid:durableId="1526096511">
+  <w:num w:numId="6" w16cid:durableId="1125924775">
     <w:abstractNumId w:val="0"/>
     <w:lvlOverride w:ilvl="0"/>
     <w:lvlOverride w:ilvl="1"/>
@@ -1218,49 +1284,49 @@
       <w:startOverride w:val="1"/>
     </w:lvlOverride>
   </w:num>
-  <w:num w:numId="7" w16cid:durableId="984511447">
+  <w:num w:numId="7" w16cid:durableId="1425498343">
     <w:abstractNumId w:val="0"/>
     <w:lvlOverride w:ilvl="0"/>
     <w:lvlOverride w:ilvl="1">
       <w:startOverride w:val="1"/>
     </w:lvlOverride>
   </w:num>
-  <w:num w:numId="8" w16cid:durableId="340396659">
+  <w:num w:numId="8" w16cid:durableId="1512523484">
     <w:abstractNumId w:val="0"/>
     <w:lvlOverride w:ilvl="0"/>
     <w:lvlOverride w:ilvl="1">
       <w:startOverride w:val="1"/>
     </w:lvlOverride>
   </w:num>
-  <w:num w:numId="9" w16cid:durableId="732196798">
+  <w:num w:numId="9" w16cid:durableId="1821190574">
     <w:abstractNumId w:val="0"/>
     <w:lvlOverride w:ilvl="0"/>
     <w:lvlOverride w:ilvl="1">
       <w:startOverride w:val="1"/>
     </w:lvlOverride>
   </w:num>
-  <w:num w:numId="10" w16cid:durableId="371345413">
+  <w:num w:numId="10" w16cid:durableId="830222226">
     <w:abstractNumId w:val="0"/>
     <w:lvlOverride w:ilvl="0"/>
     <w:lvlOverride w:ilvl="1">
       <w:startOverride w:val="1"/>
     </w:lvlOverride>
   </w:num>
-  <w:num w:numId="11" w16cid:durableId="172842775">
+  <w:num w:numId="11" w16cid:durableId="381443020">
     <w:abstractNumId w:val="0"/>
     <w:lvlOverride w:ilvl="0"/>
     <w:lvlOverride w:ilvl="1">
       <w:startOverride w:val="1"/>
     </w:lvlOverride>
   </w:num>
-  <w:num w:numId="12" w16cid:durableId="1200775090">
+  <w:num w:numId="12" w16cid:durableId="958801432">
     <w:abstractNumId w:val="0"/>
     <w:lvlOverride w:ilvl="0"/>
     <w:lvlOverride w:ilvl="1">
       <w:startOverride w:val="1"/>
     </w:lvlOverride>
   </w:num>
-  <w:num w:numId="13" w16cid:durableId="784732340">
+  <w:num w:numId="13" w16cid:durableId="2119524754">
     <w:abstractNumId w:val="0"/>
     <w:lvlOverride w:ilvl="0"/>
     <w:lvlOverride w:ilvl="1"/>
@@ -1268,7 +1334,7 @@
       <w:startOverride w:val="1"/>
     </w:lvlOverride>
   </w:num>
-  <w:num w:numId="14" w16cid:durableId="2112164708">
+  <w:num w:numId="14" w16cid:durableId="434059263">
     <w:abstractNumId w:val="0"/>
     <w:lvlOverride w:ilvl="0"/>
     <w:lvlOverride w:ilvl="1"/>
@@ -1276,7 +1342,7 @@
       <w:startOverride w:val="1"/>
     </w:lvlOverride>
   </w:num>
-  <w:num w:numId="15" w16cid:durableId="377242049">
+  <w:num w:numId="15" w16cid:durableId="314339597">
     <w:abstractNumId w:val="0"/>
     <w:lvlOverride w:ilvl="0"/>
     <w:lvlOverride w:ilvl="1"/>
@@ -1285,7 +1351,7 @@
       <w:startOverride w:val="1"/>
     </w:lvlOverride>
   </w:num>
-  <w:num w:numId="16" w16cid:durableId="377827473">
+  <w:num w:numId="16" w16cid:durableId="182981689">
     <w:abstractNumId w:val="0"/>
     <w:lvlOverride w:ilvl="0"/>
     <w:lvlOverride w:ilvl="1"/>
@@ -1293,7 +1359,7 @@
       <w:startOverride w:val="1"/>
     </w:lvlOverride>
   </w:num>
-  <w:num w:numId="17" w16cid:durableId="578174671">
+  <w:num w:numId="17" w16cid:durableId="53041504">
     <w:abstractNumId w:val="0"/>
     <w:lvlOverride w:ilvl="0"/>
     <w:lvlOverride w:ilvl="1"/>
@@ -1301,7 +1367,15 @@
       <w:startOverride w:val="1"/>
     </w:lvlOverride>
   </w:num>
-  <w:numIdMacAtCleanup w:val="17"/>
+  <w:num w:numId="18" w16cid:durableId="1764103871">
+    <w:abstractNumId w:val="0"/>
+    <w:lvlOverride w:ilvl="0"/>
+    <w:lvlOverride w:ilvl="1"/>
+    <w:lvlOverride w:ilvl="2">
+      <w:startOverride w:val="1"/>
+    </w:lvlOverride>
+  </w:num>
+  <w:numIdMacAtCleanup w:val="18"/>
 </w:numbering>
 </file>
 

</xml_diff>